<commit_message>
Update master documents and master map
</commit_message>
<xml_diff>
--- a/masters/MASTER_BIEN_BAN_HOP_DHDCD_GIAI_THE_CTCP_FINAL.docx
+++ b/masters/MASTER_BIEN_BAN_HOP_DHDCD_GIAI_THE_CTCP_FINAL.docx
@@ -254,7 +254,7 @@
                 <w:szCs w:val="26"/>
                 <w:lang w:val="en-US"/>
               </w:rPr>
-              <w:t>[NƠI KÝ], ngày ...... tháng ...... năm [NĂM]</w:t>
+              <w:t>[NƠI KÝ]</w:t>
             </w:r>
             <w:proofErr w:type="spellEnd"/>
             <w:r>
@@ -287,6 +287,7 @@
                 <w:sz w:val="26"/>
                 <w:szCs w:val="26"/>
               </w:rPr>
+              <w:t>,</w:t>
             </w:r>
             <w:r>
               <w:rPr>
@@ -296,6 +297,7 @@
                 <w:sz w:val="26"/>
                 <w:szCs w:val="26"/>
               </w:rPr>
+              <w:t xml:space="preserve"> </w:t>
             </w:r>
             <w:r>
               <w:rPr>
@@ -305,6 +307,7 @@
                 <w:sz w:val="26"/>
                 <w:szCs w:val="26"/>
               </w:rPr>
+              <w:t>ngày</w:t>
             </w:r>
             <w:r>
               <w:rPr>
@@ -314,6 +317,7 @@
                 <w:sz w:val="26"/>
                 <w:szCs w:val="26"/>
               </w:rPr>
+              <w:t xml:space="preserve"> </w:t>
             </w:r>
             <w:proofErr w:type="gramStart"/>
             <w:r>
@@ -324,6 +328,7 @@
                 <w:sz w:val="26"/>
                 <w:szCs w:val="26"/>
               </w:rPr>
+              <w:t>…</w:t>
             </w:r>
             <w:r>
               <w:rPr>
@@ -334,6 +339,7 @@
                 <w:szCs w:val="26"/>
                 <w:lang w:val="en-US"/>
               </w:rPr>
+              <w:t>..</w:t>
             </w:r>
             <w:proofErr w:type="gramEnd"/>
             <w:r>
@@ -344,6 +350,7 @@
                 <w:sz w:val="26"/>
                 <w:szCs w:val="26"/>
               </w:rPr>
+              <w:t xml:space="preserve"> </w:t>
             </w:r>
             <w:r>
               <w:rPr>
@@ -353,6 +360,7 @@
                 <w:sz w:val="26"/>
                 <w:szCs w:val="26"/>
               </w:rPr>
+              <w:t>tháng</w:t>
             </w:r>
             <w:r>
               <w:rPr>
@@ -362,6 +370,7 @@
                 <w:sz w:val="26"/>
                 <w:szCs w:val="26"/>
               </w:rPr>
+              <w:t xml:space="preserve"> …</w:t>
             </w:r>
             <w:r>
               <w:rPr>
@@ -372,6 +381,7 @@
                 <w:szCs w:val="26"/>
                 <w:lang w:val="en-US"/>
               </w:rPr>
+              <w:t>..</w:t>
             </w:r>
             <w:r>
               <w:rPr>
@@ -381,6 +391,7 @@
                 <w:sz w:val="26"/>
                 <w:szCs w:val="26"/>
               </w:rPr>
+              <w:t xml:space="preserve"> </w:t>
             </w:r>
             <w:r>
               <w:rPr>
@@ -390,6 +401,7 @@
                 <w:sz w:val="26"/>
                 <w:szCs w:val="26"/>
               </w:rPr>
+              <w:t xml:space="preserve">năm </w:t>
             </w:r>
             <w:r>
               <w:rPr>
@@ -399,6 +411,7 @@
                 <w:sz w:val="26"/>
                 <w:szCs w:val="26"/>
               </w:rPr>
+              <w:t>[NĂM]</w:t>
             </w:r>
             <w:r>
               <w:rPr>
@@ -1095,7 +1108,7 @@
             <w:pPr>
               <w:suppressAutoHyphens/>
               <w:autoSpaceDN w:val="0"/>
-              <w:spacing w:after="0" w:line="240" w:lineRule="auto" w:before="0"/>
+              <w:spacing w:after="0" w:line="240" w:lineRule="auto"/>
               <w:jc w:val="center"/>
               <w:textAlignment w:val="baseline"/>
               <w:rPr>
@@ -1744,41 +1757,6 @@
               <w:t>ứng</w:t>
             </w:r>
             <w:proofErr w:type="spellEnd"/>
-          </w:p>
-        </w:tc>
-      </w:tr>
-      <w:tr>
-        <w:trPr>
-          <w:trHeight w:val="831"/>
-          <w:jc w:val="center"/>
-        </w:trPr>
-        <w:tc>
-          <w:tcPr>
-            <w:tcW w:w="978" w:type="dxa"/>
-            <w:tcBorders>
-              <w:top w:val="single" w:sz="4" w:space="0" w:color="000000"/>
-              <w:left w:val="single" w:sz="4" w:space="0" w:color="000000"/>
-              <w:bottom w:val="single" w:sz="4" w:space="0" w:color="000000"/>
-              <w:right w:val="single" w:sz="4" w:space="0" w:color="000000"/>
-            </w:tcBorders>
-            <w:shd w:val="clear" w:color="auto" w:fill="auto"/>
-            <w:tcMar>
-              <w:top w:w="0" w:type="dxa"/>
-              <w:left w:w="108" w:type="dxa"/>
-              <w:bottom w:w="0" w:type="dxa"/>
-              <w:right w:w="108" w:type="dxa"/>
-            </w:tcMar>
-            <w:vAlign w:val="center"/>
-            <w:gridSpan w:val="7"/>
-          </w:tcPr>
-          <w:p>
-            <w:r>
-              <w:rPr>
-                <w:color w:val="000000"/>
-                <w:sz w:val="16"/>
-              </w:rPr>
-              <w:t>[BEGIN_CO_DONG]</w:t>
-            </w:r>
           </w:p>
         </w:tc>
       </w:tr>
@@ -1808,13 +1786,9 @@
           </w:tcPr>
           <w:p>
             <w:pPr>
-              <w:numPr>
-                <w:ilvl w:val="0"/>
-                <w:numId w:val="13"/>
-              </w:numPr>
               <w:suppressAutoHyphens/>
               <w:autoSpaceDN w:val="0"/>
-              <w:spacing w:after="0" w:line="240" w:lineRule="auto" w:before="0"/>
+              <w:spacing w:after="0" w:line="240" w:lineRule="auto"/>
               <w:jc w:val="center"/>
               <w:textAlignment w:val="baseline"/>
               <w:rPr>
@@ -1826,10 +1800,8 @@
               </w:rPr>
             </w:pPr>
             <w:r>
-              <w:rPr>
-                <w:color w:val="000000"/>
-                <w:sz w:val="16"/>
-              </w:rPr>
+              <w:t>[BEGIN_CO_DONG]</w:t>
+              <w:br/>
               <w:t>[STT]</w:t>
             </w:r>
           </w:p>
@@ -1856,7 +1828,7 @@
             <w:pPr>
               <w:suppressAutoHyphens/>
               <w:autoSpaceDN w:val="0"/>
-              <w:spacing w:line="240" w:lineRule="auto" w:before="0" w:after="0"/>
+              <w:spacing w:line="240" w:lineRule="auto"/>
               <w:jc w:val="center"/>
               <w:textAlignment w:val="baseline"/>
               <w:rPr>
@@ -1874,7 +1846,7 @@
                 <w:bCs/>
                 <w:iCs/>
                 <w:color w:val="000000"/>
-                <w:sz w:val="16"/>
+                <w:sz w:val="26"/>
                 <w:szCs w:val="26"/>
               </w:rPr>
               <w:t>[TÊN CỔ ĐÔNG]</w:t>
@@ -1901,7 +1873,7 @@
           </w:tcPr>
           <w:p>
             <w:pPr>
-              <w:spacing w:after="0" w:line="240" w:lineRule="auto" w:before="0"/>
+              <w:spacing w:after="0" w:line="240" w:lineRule="auto"/>
               <w:jc w:val="center"/>
               <w:rPr>
                 <w:rFonts w:ascii="Times New Roman" w:eastAsia="Calibri" w:hAnsi="Times New Roman" w:cs="Times New Roman"/>
@@ -1916,7 +1888,7 @@
                 <w:rFonts w:ascii="Times New Roman" w:eastAsia="Calibri" w:hAnsi="Times New Roman" w:cs="Times New Roman"/>
                 <w:bCs/>
                 <w:color w:val="000000"/>
-                <w:sz w:val="16"/>
+                <w:sz w:val="26"/>
                 <w:szCs w:val="26"/>
                 <w:lang w:val="fr-FR"/>
               </w:rPr>
@@ -1946,7 +1918,7 @@
             <w:pPr>
               <w:suppressAutoHyphens/>
               <w:autoSpaceDN w:val="0"/>
-              <w:spacing w:after="0" w:line="240" w:lineRule="auto" w:before="0"/>
+              <w:spacing w:after="0" w:line="240" w:lineRule="auto"/>
               <w:jc w:val="center"/>
               <w:textAlignment w:val="baseline"/>
               <w:rPr>
@@ -1962,7 +1934,7 @@
               <w:rPr>
                 <w:rFonts w:ascii="Times New Roman" w:eastAsia="Calibri" w:hAnsi="Times New Roman" w:cs="Times New Roman"/>
                 <w:color w:val="000000"/>
-                <w:sz w:val="16"/>
+                <w:sz w:val="26"/>
                 <w:szCs w:val="26"/>
                 <w:lang w:val="en-US"/>
               </w:rPr>
@@ -1973,7 +1945,7 @@
               <w:rPr>
                 <w:rFonts w:ascii="Times New Roman" w:eastAsia="Calibri" w:hAnsi="Times New Roman" w:cs="Times New Roman"/>
                 <w:color w:val="000000"/>
-                <w:sz w:val="16"/>
+                <w:sz w:val="26"/>
                 <w:szCs w:val="26"/>
                 <w:lang w:val="en-US"/>
               </w:rPr>
@@ -1983,7 +1955,7 @@
               <w:rPr>
                 <w:rFonts w:ascii="Times New Roman" w:eastAsia="Calibri" w:hAnsi="Times New Roman" w:cs="Times New Roman"/>
                 <w:color w:val="000000"/>
-                <w:sz w:val="16"/>
+                <w:sz w:val="26"/>
                 <w:szCs w:val="26"/>
                 <w:lang w:val="en-US"/>
               </w:rPr>
@@ -2011,7 +1983,7 @@
           </w:tcPr>
           <w:p>
             <w:pPr>
-              <w:spacing w:after="0" w:line="240" w:lineRule="auto" w:before="0"/>
+              <w:spacing w:after="0" w:line="240" w:lineRule="auto"/>
               <w:jc w:val="center"/>
               <w:rPr>
                 <w:rFonts w:ascii="Times New Roman" w:eastAsia="Calibri" w:hAnsi="Times New Roman" w:cs="Times New Roman"/>
@@ -2026,7 +1998,7 @@
                 <w:rFonts w:ascii="Times New Roman" w:eastAsia="Calibri" w:hAnsi="Times New Roman" w:cs="Times New Roman"/>
                 <w:bCs/>
                 <w:color w:val="000000"/>
-                <w:sz w:val="16"/>
+                <w:sz w:val="26"/>
                 <w:szCs w:val="26"/>
                 <w:lang w:val="fr-FR"/>
               </w:rPr>
@@ -2037,7 +2009,7 @@
                 <w:rFonts w:ascii="Times New Roman" w:eastAsia="Calibri" w:hAnsi="Times New Roman" w:cs="Times New Roman"/>
                 <w:bCs/>
                 <w:color w:val="000000"/>
-                <w:sz w:val="16"/>
+                <w:sz w:val="26"/>
                 <w:szCs w:val="26"/>
                 <w:lang w:val="fr-FR"/>
               </w:rPr>
@@ -2061,7 +2033,7 @@
           </w:tcPr>
           <w:p>
             <w:pPr>
-              <w:spacing w:after="0" w:line="240" w:lineRule="auto" w:before="0"/>
+              <w:spacing w:after="0" w:line="240" w:lineRule="auto"/>
               <w:jc w:val="center"/>
               <w:rPr>
                 <w:rFonts w:ascii="Times New Roman" w:eastAsia="Calibri" w:hAnsi="Times New Roman" w:cs="Times New Roman"/>
@@ -2076,7 +2048,7 @@
                 <w:rFonts w:ascii="Times New Roman" w:eastAsia="Calibri" w:hAnsi="Times New Roman" w:cs="Times New Roman"/>
                 <w:bCs/>
                 <w:color w:val="000000"/>
-                <w:sz w:val="16"/>
+                <w:sz w:val="26"/>
                 <w:szCs w:val="26"/>
                 <w:lang w:val="fr-FR"/>
               </w:rPr>
@@ -2104,7 +2076,7 @@
           </w:tcPr>
           <w:p>
             <w:pPr>
-              <w:spacing w:after="0" w:line="240" w:lineRule="auto" w:before="0"/>
+              <w:spacing w:after="0" w:line="240" w:lineRule="auto"/>
               <w:jc w:val="center"/>
               <w:rPr>
                 <w:rFonts w:ascii="Times New Roman" w:eastAsia="Calibri" w:hAnsi="Times New Roman" w:cs="Times New Roman"/>
@@ -2119,48 +2091,12 @@
                 <w:rFonts w:ascii="Times New Roman" w:eastAsia="Calibri" w:hAnsi="Times New Roman" w:cs="Times New Roman"/>
                 <w:bCs/>
                 <w:color w:val="000000"/>
-                <w:sz w:val="16"/>
+                <w:sz w:val="26"/>
                 <w:szCs w:val="26"/>
                 <w:lang w:val="fr-FR"/>
               </w:rPr>
               <w:t>[SỐ PHIẾU BIỂU QUYẾT]</w:t>
-            </w:r>
-          </w:p>
-        </w:tc>
-      </w:tr>
-      <w:tr>
-        <w:trPr>
-          <w:trHeight w:val="831"/>
-          <w:jc w:val="center"/>
-        </w:trPr>
-        <w:tc>
-          <w:tcPr>
-            <w:tcW w:w="978" w:type="dxa"/>
-            <w:tcBorders>
-              <w:top w:val="single" w:sz="4" w:space="0" w:color="000000"/>
-              <w:left w:val="single" w:sz="4" w:space="0" w:color="000000"/>
-              <w:bottom w:val="single" w:sz="4" w:space="0" w:color="000000"/>
-              <w:right w:val="single" w:sz="4" w:space="0" w:color="000000"/>
-            </w:tcBorders>
-            <w:shd w:val="clear" w:color="auto" w:fill="auto"/>
-            <w:tcMar>
-              <w:top w:w="0" w:type="dxa"/>
-              <w:left w:w="108" w:type="dxa"/>
-              <w:bottom w:w="0" w:type="dxa"/>
-              <w:right w:w="108" w:type="dxa"/>
-            </w:tcMar>
-            <w:vAlign w:val="center"/>
-            <w:gridSpan w:val="7"/>
-          </w:tcPr>
-          <w:p>
-            <w:pPr>
-              <w:spacing w:before="0" w:after="0"/>
-            </w:pPr>
-            <w:r>
-              <w:rPr>
-                <w:color w:val="000000"/>
-                <w:sz w:val="16"/>
-              </w:rPr>
+              <w:br/>
               <w:t>[END_CO_DONG]</w:t>
             </w:r>
           </w:p>
@@ -3306,7 +3242,7 @@
           <w:szCs w:val="26"/>
           <w:lang w:val="en-US"/>
         </w:rPr>
-        <w:t xml:space="preserve">Tổng </w:t>
+        <w:t>[CHỨC VỤ NGƯỜI ĐẠI DIỆN]</w:t>
       </w:r>
       <w:proofErr w:type="spellStart"/>
       <w:r>
@@ -3317,7 +3253,6 @@
           <w:szCs w:val="26"/>
           <w:lang w:val="en-US"/>
         </w:rPr>
-        <w:t>giám</w:t>
       </w:r>
       <w:proofErr w:type="spellEnd"/>
       <w:r>
@@ -3328,7 +3263,6 @@
           <w:szCs w:val="26"/>
           <w:lang w:val="en-US"/>
         </w:rPr>
-        <w:t xml:space="preserve"> </w:t>
       </w:r>
       <w:proofErr w:type="spellStart"/>
       <w:r>
@@ -3339,7 +3273,6 @@
           <w:szCs w:val="26"/>
           <w:lang w:val="en-US"/>
         </w:rPr>
-        <w:t>đốc</w:t>
       </w:r>
       <w:proofErr w:type="spellEnd"/>
       <w:r>
@@ -3564,7 +3497,7 @@
           <w:szCs w:val="26"/>
           <w:lang w:val="en-US"/>
         </w:rPr>
-        <w:t>[TỔNG SỐ PHIẾU BIỂU QUYẾT]</w:t>
+        <w:t>[TỔNG SỐ PHIẾU BIỂU QUYẾT] phiếu</w:t>
       </w:r>
       <w:r>
         <w:rPr>
@@ -3591,7 +3524,6 @@
           <w:szCs w:val="26"/>
           <w:lang w:val="en-US"/>
         </w:rPr>
-        <w:t xml:space="preserve"> </w:t>
       </w:r>
       <w:r>
         <w:rPr>
@@ -3600,7 +3532,6 @@
           <w:sz w:val="26"/>
           <w:szCs w:val="26"/>
         </w:rPr>
-        <w:t>phiếu</w:t>
       </w:r>
     </w:p>
     <w:p>
@@ -3679,7 +3610,7 @@
           <w:szCs w:val="26"/>
           <w:lang w:val="en-US"/>
         </w:rPr>
-        <w:t>[TỔNG SỐ PHIẾU BIỂU QUYẾT]</w:t>
+        <w:t>[TỔNG SỐ PHIẾU BIỂU QUYẾT] phiếu</w:t>
       </w:r>
       <w:r>
         <w:rPr>
@@ -3697,7 +3628,6 @@
           <w:szCs w:val="26"/>
           <w:lang w:val="en-US"/>
         </w:rPr>
-        <w:t xml:space="preserve"> </w:t>
       </w:r>
       <w:r>
         <w:rPr>
@@ -3706,7 +3636,6 @@
           <w:sz w:val="26"/>
           <w:szCs w:val="26"/>
         </w:rPr>
-        <w:t>phiế</w:t>
       </w:r>
       <w:r>
         <w:rPr>
@@ -3715,7 +3644,6 @@
           <w:sz w:val="26"/>
           <w:szCs w:val="26"/>
         </w:rPr>
-        <w:t>u</w:t>
       </w:r>
       <w:r>
         <w:rPr>
@@ -3828,7 +3756,7 @@
           <w:szCs w:val="26"/>
           <w:lang w:val="en-US"/>
         </w:rPr>
-        <w:t>[TỔNG SỐ PHIẾU BIỂU QUYẾT]</w:t>
+        <w:t>[TỔNG SỐ PHIẾU BIỂU QUYẾT] phiếu</w:t>
       </w:r>
       <w:r>
         <w:rPr>
@@ -3846,7 +3774,6 @@
           <w:szCs w:val="26"/>
           <w:lang w:val="en-US"/>
         </w:rPr>
-        <w:t xml:space="preserve"> </w:t>
       </w:r>
       <w:r>
         <w:rPr>
@@ -3855,7 +3782,6 @@
           <w:sz w:val="26"/>
           <w:szCs w:val="26"/>
         </w:rPr>
-        <w:t>phiếu</w:t>
       </w:r>
       <w:r>
         <w:rPr>

</xml_diff>